<commit_message>
tipo delle maiuscole or something
</commit_message>
<xml_diff>
--- a/Documenti e diagrammi/doc/Documento dei requisiti.docx
+++ b/Documenti e diagrammi/doc/Documento dei requisiti.docx
@@ -28,6 +28,7 @@
       </w:pPr>
       <w:bookmarkStart w:id="0" w:name="_Hlk487785372"/>
       <w:bookmarkEnd w:id="0"/>
+      <w:proofErr w:type="spellStart"/>
       <w:r>
         <w:rPr>
           <w:sz w:val="32"/>
@@ -36,6 +37,7 @@
         </w:rPr>
         <w:t>WebMiningProject</w:t>
       </w:r>
+      <w:proofErr w:type="spellEnd"/>
     </w:p>
     <w:p>
       <w:pPr>
@@ -707,7 +709,13 @@
         <w:t xml:space="preserve"> </w:t>
       </w:r>
       <w:r>
-        <w:t>formato json.</w:t>
+        <w:t xml:space="preserve">formato </w:t>
+      </w:r>
+      <w:r>
+        <w:t>JSON</w:t>
+      </w:r>
+      <w:r>
+        <w:t>.</w:t>
       </w:r>
     </w:p>
     <w:p>
@@ -809,7 +817,18 @@
         <w:pStyle w:val="Paragrafoelenco"/>
       </w:pPr>
       <w:r>
-        <w:t xml:space="preserve">I 50 termini più importanti vengono memorizzati in un file di testo (txt). Ogni riga del file </w:t>
+        <w:t>I 50 termini più importanti vengono memorizzati in un file di testo (</w:t>
+      </w:r>
+      <w:r>
+        <w:t>.</w:t>
+      </w:r>
+      <w:proofErr w:type="spellStart"/>
+      <w:r>
+        <w:t>txt</w:t>
+      </w:r>
+      <w:proofErr w:type="spellEnd"/>
+      <w:r>
+        <w:t xml:space="preserve">). Ogni riga del file </w:t>
       </w:r>
       <w:r>
         <w:t>viene visualizzata nel formato “termine peso”.</w:t>
@@ -929,15 +948,40 @@
           <w:b/>
           <w:bCs/>
         </w:rPr>
-        <w:t>Unit testing con JUnit</w:t>
+        <w:t xml:space="preserve">Unit testing con </w:t>
       </w:r>
+      <w:proofErr w:type="spellStart"/>
+      <w:r>
+        <w:rPr>
+          <w:b/>
+          <w:bCs/>
+        </w:rPr>
+        <w:t>JUnit</w:t>
+      </w:r>
+      <w:proofErr w:type="spellEnd"/>
     </w:p>
     <w:p>
       <w:pPr>
         <w:pStyle w:val="Paragrafoelenco"/>
       </w:pPr>
       <w:r>
-        <w:t>Il codice del sistema è stato sottoposto a unit testing utilizzando il framework JUnit.</w:t>
+        <w:t xml:space="preserve">Il codice del sistema è stato sottoposto a </w:t>
+      </w:r>
+      <w:proofErr w:type="spellStart"/>
+      <w:r>
+        <w:t>unit</w:t>
+      </w:r>
+      <w:proofErr w:type="spellEnd"/>
+      <w:r>
+        <w:t xml:space="preserve"> testing utilizzando il framework </w:t>
+      </w:r>
+      <w:proofErr w:type="spellStart"/>
+      <w:r>
+        <w:t>JUnit</w:t>
+      </w:r>
+      <w:proofErr w:type="spellEnd"/>
+      <w:r>
+        <w:t>.</w:t>
       </w:r>
     </w:p>
     <w:p>
@@ -1514,7 +1558,15 @@
         <w:t>Salvataggio d</w:t>
       </w:r>
       <w:r>
-        <w:t>i tutti gli articoli in un file in formato json.</w:t>
+        <w:t xml:space="preserve">i tutti gli articoli in un file in formato </w:t>
+      </w:r>
+      <w:proofErr w:type="spellStart"/>
+      <w:r>
+        <w:t>json</w:t>
+      </w:r>
+      <w:proofErr w:type="spellEnd"/>
+      <w:r>
+        <w:t>.</w:t>
       </w:r>
     </w:p>
     <w:p>
@@ -1887,7 +1939,17 @@
         <w:spacing w:before="0" w:line="240" w:lineRule="auto"/>
       </w:pPr>
       <w:r>
-        <w:t>L’utente scrive da riga di comando ‘-e’ e preme invio.</w:t>
+        <w:t>L’utente scrive da riga di comando ‘-</w:t>
+      </w:r>
+      <w:proofErr w:type="spellStart"/>
+      <w:proofErr w:type="gramStart"/>
+      <w:r>
+        <w:t>e’</w:t>
+      </w:r>
+      <w:proofErr w:type="spellEnd"/>
+      <w:proofErr w:type="gramEnd"/>
+      <w:r>
+        <w:t xml:space="preserve"> e preme invio.</w:t>
       </w:r>
     </w:p>
     <w:p>
@@ -2085,8 +2147,13 @@
         <w:spacing w:before="0" w:line="240" w:lineRule="auto"/>
       </w:pPr>
       <w:r>
-        <w:t>Salvataggio di tutti gli articoli in un file in formato json</w:t>
+        <w:t xml:space="preserve">Salvataggio di tutti gli articoli in un file in formato </w:t>
       </w:r>
+      <w:proofErr w:type="spellStart"/>
+      <w:r>
+        <w:t>json</w:t>
+      </w:r>
+      <w:proofErr w:type="spellEnd"/>
       <w:r>
         <w:t>.</w:t>
       </w:r>
@@ -2168,7 +2235,17 @@
         <w:t>dall’argomento di suo interesse all’interno di due doppie virgolette</w:t>
       </w:r>
       <w:r>
-        <w:t xml:space="preserve">, a sua volta seguito dal comando ‘-e’ </w:t>
+        <w:t>, a sua volta seguito dal comando ‘-</w:t>
+      </w:r>
+      <w:proofErr w:type="spellStart"/>
+      <w:proofErr w:type="gramStart"/>
+      <w:r>
+        <w:t>e’</w:t>
+      </w:r>
+      <w:proofErr w:type="spellEnd"/>
+      <w:proofErr w:type="gramEnd"/>
+      <w:r>
+        <w:t xml:space="preserve"> </w:t>
       </w:r>
       <w:r>
         <w:t>e preme invio.</w:t>
@@ -3100,8 +3177,13 @@
       </w:r>
     </w:p>
     <w:p>
+      <w:proofErr w:type="spellStart"/>
       <w:r>
-        <w:t xml:space="preserve">PlantUML - </w:t>
+        <w:t>PlantUML</w:t>
+      </w:r>
+      <w:proofErr w:type="spellEnd"/>
+      <w:r>
+        <w:t xml:space="preserve"> - </w:t>
       </w:r>
       <w:hyperlink r:id="rId9" w:history="1">
         <w:r>
@@ -3116,15 +3198,20 @@
       <w:pPr>
         <w:rPr>
           <w:rFonts w:eastAsia="Times New Roman"/>
+          <w:lang w:val="en-US"/>
         </w:rPr>
       </w:pPr>
       <w:r>
+        <w:rPr>
+          <w:lang w:val="en-US"/>
+        </w:rPr>
         <w:t xml:space="preserve">Draw.io - </w:t>
       </w:r>
       <w:hyperlink r:id="rId10" w:history="1">
         <w:r>
           <w:rPr>
             <w:rStyle w:val="Collegamentoipertestuale"/>
+            <w:lang w:val="en-US"/>
           </w:rPr>
           <w:t>https://app.diagrams.net/</w:t>
         </w:r>
@@ -3138,11 +3225,19 @@
           <w:u w:val="single"/>
         </w:rPr>
       </w:pPr>
+      <w:proofErr w:type="spellStart"/>
       <w:r>
         <w:rPr>
           <w:rFonts w:eastAsia="Times New Roman"/>
         </w:rPr>
-        <w:t xml:space="preserve">IntelliJ - </w:t>
+        <w:t>IntelliJ</w:t>
+      </w:r>
+      <w:proofErr w:type="spellEnd"/>
+      <w:r>
+        <w:rPr>
+          <w:rFonts w:eastAsia="Times New Roman"/>
+        </w:rPr>
+        <w:t xml:space="preserve"> - </w:t>
       </w:r>
       <w:hyperlink r:id="rId11" w:history="1">
         <w:r>
@@ -3205,7 +3300,15 @@
         <w:t xml:space="preserve">Slide delle lezioni </w:t>
       </w:r>
       <w:r>
-        <w:t>presenti nel corso moodle di Elementi di Ingegneria del Software dell’Università di Padova</w:t>
+        <w:t xml:space="preserve">presenti nel corso </w:t>
+      </w:r>
+      <w:proofErr w:type="spellStart"/>
+      <w:r>
+        <w:t>moodle</w:t>
+      </w:r>
+      <w:proofErr w:type="spellEnd"/>
+      <w:r>
+        <w:t xml:space="preserve"> di Elementi di Ingegneria del Software dell’Università di Padova</w:t>
       </w:r>
     </w:p>
     <w:p>
@@ -3288,19 +3391,34 @@
       </w:hyperlink>
     </w:p>
     <w:p>
+      <w:pPr>
+        <w:rPr>
+          <w:lang w:val="en-US"/>
+        </w:rPr>
+      </w:pPr>
       <w:r>
+        <w:rPr>
+          <w:lang w:val="en-US"/>
+        </w:rPr>
         <w:t xml:space="preserve">Content API The Guardian - </w:t>
       </w:r>
       <w:hyperlink r:id="rId15" w:history="1">
         <w:r>
           <w:rPr>
             <w:rStyle w:val="Collegamentoipertestuale"/>
+            <w:lang w:val="en-US"/>
           </w:rPr>
           <w:t>https://github.com/matarrese/content-api-the-guardian</w:t>
         </w:r>
       </w:hyperlink>
     </w:p>
-    <w:p/>
+    <w:p>
+      <w:pPr>
+        <w:rPr>
+          <w:lang w:val="en-US"/>
+        </w:rPr>
+      </w:pPr>
+    </w:p>
     <w:sectPr>
       <w:footerReference w:type="default" r:id="rId16"/>
       <w:pgSz w:w="11906" w:h="16838" w:code="9"/>

</xml_diff>

<commit_message>
modifiche al documento dei requisiti
</commit_message>
<xml_diff>
--- a/Documenti e diagrammi/doc/Documento dei requisiti.docx
+++ b/Documenti e diagrammi/doc/Documento dei requisiti.docx
@@ -2990,14 +2990,6 @@
       </w:r>
     </w:p>
     <w:p>
-      <w:pPr>
-        <w:rPr>
-          <w:b/>
-          <w:bCs/>
-          <w:sz w:val="24"/>
-          <w:szCs w:val="24"/>
-        </w:rPr>
-      </w:pPr>
       <w:r>
         <w:rPr>
           <w:b/>
@@ -3005,7 +2997,136 @@
           <w:sz w:val="24"/>
           <w:szCs w:val="24"/>
         </w:rPr>
-        <w:t xml:space="preserve">3.1 </w:t>
+        <w:t>3.</w:t>
+      </w:r>
+      <w:r>
+        <w:rPr>
+          <w:b/>
+          <w:bCs/>
+          <w:sz w:val="24"/>
+          <w:szCs w:val="24"/>
+        </w:rPr>
+        <w:t>1</w:t>
+      </w:r>
+      <w:r>
+        <w:rPr>
+          <w:b/>
+          <w:bCs/>
+          <w:sz w:val="24"/>
+          <w:szCs w:val="24"/>
+        </w:rPr>
+        <w:t xml:space="preserve"> Diagramma dei casi d’uso</w:t>
+      </w:r>
+    </w:p>
+    <w:p>
+      <w:r>
+        <w:t xml:space="preserve">Il documento “DiagrammaCasiUso.pdf” in allegato </w:t>
+      </w:r>
+      <w:r>
+        <w:t xml:space="preserve">(e riportato sopra) </w:t>
+      </w:r>
+      <w:r>
+        <w:t>descrive le</w:t>
+      </w:r>
+      <w:r>
+        <w:t xml:space="preserve"> relazioni fra le funzionalità specifiche che compongono il caso d’uso preso in esame.</w:t>
+      </w:r>
+    </w:p>
+    <w:p>
+      <w:pPr>
+        <w:rPr>
+          <w:b/>
+          <w:bCs/>
+          <w:sz w:val="24"/>
+          <w:szCs w:val="24"/>
+        </w:rPr>
+      </w:pPr>
+      <w:r>
+        <w:rPr>
+          <w:b/>
+          <w:bCs/>
+          <w:sz w:val="24"/>
+          <w:szCs w:val="24"/>
+        </w:rPr>
+        <w:t>3.</w:t>
+      </w:r>
+      <w:r>
+        <w:rPr>
+          <w:b/>
+          <w:bCs/>
+          <w:sz w:val="24"/>
+          <w:szCs w:val="24"/>
+        </w:rPr>
+        <w:t>2</w:t>
+      </w:r>
+      <w:r>
+        <w:rPr>
+          <w:b/>
+          <w:bCs/>
+          <w:sz w:val="24"/>
+          <w:szCs w:val="24"/>
+        </w:rPr>
+        <w:t xml:space="preserve"> </w:t>
+      </w:r>
+      <w:r>
+        <w:rPr>
+          <w:b/>
+          <w:bCs/>
+          <w:sz w:val="24"/>
+          <w:szCs w:val="24"/>
+        </w:rPr>
+        <w:t>Domain model</w:t>
+      </w:r>
+    </w:p>
+    <w:p>
+      <w:r>
+        <w:t>Il documento “</w:t>
+      </w:r>
+      <w:r>
+        <w:t>DomainModel.pdf</w:t>
+      </w:r>
+      <w:r>
+        <w:t xml:space="preserve">” in allegato </w:t>
+      </w:r>
+      <w:r>
+        <w:t>descrive schematicamente le associazioni e cardinalità tra le diverse classi.</w:t>
+      </w:r>
+    </w:p>
+    <w:p>
+      <w:pPr>
+        <w:rPr>
+          <w:b/>
+          <w:bCs/>
+          <w:sz w:val="24"/>
+          <w:szCs w:val="24"/>
+        </w:rPr>
+      </w:pPr>
+      <w:r>
+        <w:rPr>
+          <w:b/>
+          <w:bCs/>
+          <w:sz w:val="24"/>
+          <w:szCs w:val="24"/>
+        </w:rPr>
+        <w:t>3.</w:t>
+      </w:r>
+      <w:r>
+        <w:rPr>
+          <w:b/>
+          <w:bCs/>
+          <w:sz w:val="24"/>
+          <w:szCs w:val="24"/>
+        </w:rPr>
+        <w:t>3</w:t>
+      </w:r>
+      <w:r>
+        <w:rPr>
+          <w:b/>
+          <w:bCs/>
+          <w:sz w:val="24"/>
+          <w:szCs w:val="24"/>
+        </w:rPr>
+        <w:t xml:space="preserve"> </w:t>
       </w:r>
       <w:r>
         <w:rPr>
@@ -3037,10 +3158,10 @@
     </w:p>
     <w:p>
       <w:r>
-        <w:t>Il documento “DiagrammaDelleClassi.pdf” in allegato si riferisce allo specifico caso d’uso preso in esame, ma vi sono mostrate quasi tutte le classi e associazioni del sistem</w:t>
+        <w:t xml:space="preserve">Il documento “DiagrammaDelleClassi.pdf” in allegato </w:t>
       </w:r>
       <w:r>
-        <w:t>a</w:t>
+        <w:t>descrive nel dettaglio le strutture interne (metodi, attributi) delle classi e le associazioni tra di esse</w:t>
       </w:r>
       <w:r>
         <w:t>.</w:t>
@@ -3071,12 +3192,33 @@
           <w:sz w:val="24"/>
           <w:szCs w:val="24"/>
         </w:rPr>
-        <w:t>3.2 Diagramma di sequenza</w:t>
+        <w:t>3.</w:t>
+      </w:r>
+      <w:r>
+        <w:rPr>
+          <w:b/>
+          <w:bCs/>
+          <w:sz w:val="24"/>
+          <w:szCs w:val="24"/>
+        </w:rPr>
+        <w:t>4</w:t>
+      </w:r>
+      <w:r>
+        <w:rPr>
+          <w:b/>
+          <w:bCs/>
+          <w:sz w:val="24"/>
+          <w:szCs w:val="24"/>
+        </w:rPr>
+        <w:t xml:space="preserve"> Diagramma di sequenza</w:t>
       </w:r>
     </w:p>
     <w:p>
       <w:r>
-        <w:t>Il documento “DiagrammaDiSequenza.pdf” in allegato si riferisce allo specifico caso d’uso preso in esame, con particolare riferimento allo scambio temporale di messaggi tra gli oggetti.</w:t>
+        <w:t xml:space="preserve">Il documento “DiagrammaDiSequenza.pdf” in allegato </w:t>
+      </w:r>
+      <w:r>
+        <w:t>descrive l’ordine temporale dell’esecuzione dei vari metodi e gli scambi di dati tra le diverse classi.</w:t>
       </w:r>
     </w:p>
     <w:p>
@@ -3087,7 +3229,7 @@
           <w:sz w:val="24"/>
           <w:szCs w:val="24"/>
         </w:rPr>
-        <w:t xml:space="preserve"> </w:t>
+        <w:t>3.</w:t>
       </w:r>
       <w:r>
         <w:rPr>
@@ -3096,7 +3238,16 @@
           <w:sz w:val="24"/>
           <w:szCs w:val="24"/>
         </w:rPr>
-        <w:t xml:space="preserve">3.3 Diagramma </w:t>
+        <w:t>5</w:t>
+      </w:r>
+      <w:r>
+        <w:rPr>
+          <w:b/>
+          <w:bCs/>
+          <w:sz w:val="24"/>
+          <w:szCs w:val="24"/>
+        </w:rPr>
+        <w:t xml:space="preserve"> Diagramma </w:t>
       </w:r>
       <w:r>
         <w:rPr>
@@ -3110,7 +3261,19 @@
     </w:p>
     <w:p>
       <w:r>
-        <w:t>Il documento “DiagrammaDelleAttivita.pdf” in allegato si riferisce allo specifico caso d’uso preso in esame, mostrando il flusso delle attività che lo compongono.</w:t>
+        <w:t xml:space="preserve">Il documento “DiagrammaDelleAttivita.pdf” in allegato </w:t>
+      </w:r>
+      <w:r>
+        <w:t xml:space="preserve">descrive il </w:t>
+      </w:r>
+      <w:r>
+        <w:t xml:space="preserve">flusso delle attività che </w:t>
+      </w:r>
+      <w:r>
+        <w:t>compongono il programma</w:t>
+      </w:r>
+      <w:r>
+        <w:t>.</w:t>
       </w:r>
     </w:p>
     <w:p>
@@ -3121,15 +3284,8 @@
           <w:sz w:val="24"/>
           <w:szCs w:val="24"/>
         </w:rPr>
-        <w:t>3.4 Diagramma dei casi d’uso</w:t>
+        <w:t>3.</w:t>
       </w:r>
-    </w:p>
-    <w:p>
-      <w:r>
-        <w:t>Il documento “DiagrammaCasiUso.pdf” in allegato si riferisce alle relazioni fra le funzionalità specifiche che compongono il caso d’uso preso in esame.</w:t>
-      </w:r>
-    </w:p>
-    <w:p>
       <w:r>
         <w:rPr>
           <w:b/>
@@ -3137,7 +3293,16 @@
           <w:sz w:val="24"/>
           <w:szCs w:val="24"/>
         </w:rPr>
-        <w:t xml:space="preserve">3.5 Manuale d’uso </w:t>
+        <w:t>6</w:t>
+      </w:r>
+      <w:r>
+        <w:rPr>
+          <w:b/>
+          <w:bCs/>
+          <w:sz w:val="24"/>
+          <w:szCs w:val="24"/>
+        </w:rPr>
+        <w:t xml:space="preserve"> Manuale d’uso </w:t>
       </w:r>
     </w:p>
     <w:p>
@@ -3173,7 +3338,25 @@
           <w:sz w:val="24"/>
           <w:szCs w:val="24"/>
         </w:rPr>
-        <w:t>3.6 Software utilizzati</w:t>
+        <w:t>3.</w:t>
+      </w:r>
+      <w:r>
+        <w:rPr>
+          <w:b/>
+          <w:bCs/>
+          <w:sz w:val="24"/>
+          <w:szCs w:val="24"/>
+        </w:rPr>
+        <w:t>7</w:t>
+      </w:r>
+      <w:r>
+        <w:rPr>
+          <w:b/>
+          <w:bCs/>
+          <w:sz w:val="24"/>
+          <w:szCs w:val="24"/>
+        </w:rPr>
+        <w:t xml:space="preserve"> Software utilizzati</w:t>
       </w:r>
     </w:p>
     <w:p>
@@ -3259,6 +3442,55 @@
     <w:p>
       <w:pPr>
         <w:rPr>
+          <w:rFonts w:eastAsia="Times New Roman"/>
+        </w:rPr>
+      </w:pPr>
+    </w:p>
+    <w:p>
+      <w:pPr>
+        <w:rPr>
+          <w:rFonts w:eastAsia="Times New Roman"/>
+        </w:rPr>
+      </w:pPr>
+    </w:p>
+    <w:p>
+      <w:pPr>
+        <w:rPr>
+          <w:rFonts w:eastAsia="Times New Roman"/>
+        </w:rPr>
+      </w:pPr>
+    </w:p>
+    <w:p>
+      <w:pPr>
+        <w:rPr>
+          <w:rFonts w:eastAsia="Times New Roman"/>
+        </w:rPr>
+      </w:pPr>
+    </w:p>
+    <w:p>
+      <w:pPr>
+        <w:rPr>
+          <w:rFonts w:eastAsia="Times New Roman"/>
+        </w:rPr>
+      </w:pPr>
+    </w:p>
+    <w:p>
+      <w:pPr>
+        <w:rPr>
+          <w:rFonts w:eastAsia="Times New Roman"/>
+        </w:rPr>
+      </w:pPr>
+    </w:p>
+    <w:p>
+      <w:pPr>
+        <w:rPr>
+          <w:rFonts w:eastAsia="Times New Roman"/>
+        </w:rPr>
+      </w:pPr>
+    </w:p>
+    <w:p>
+      <w:pPr>
+        <w:rPr>
           <w:b/>
           <w:bCs/>
           <w:sz w:val="32"/>
@@ -3273,6 +3505,7 @@
           <w:sz w:val="32"/>
           <w:szCs w:val="32"/>
         </w:rPr>
+        <w:lastRenderedPageBreak/>
         <w:t>4. Appendice</w:t>
       </w:r>
     </w:p>

</xml_diff>